<commit_message>
Draft_015: fix Combined Example “potential” highlight + generalize color description
- Applied true-hedge formatting (red highlight / white text / strike) to “potential” so it matches “suggested” and the rest of the corpus coding pattern
- Kept orange (EC) function mark
- Description now reads “Colored highlights / Colored text marks / Grey highlights” instead of naming specific red/orange colors
- Override both docx and pdf
</commit_message>
<xml_diff>
--- a/thesis/003_ThesisProposal_Draft_015.docx
+++ b/thesis/003_ThesisProposal_Draft_015.docx
@@ -11157,17 +11157,35 @@
       </w:r>
       <w:r>
         <w:rPr>
-          <w:rFonts w:ascii="Georgia" w:cs="Georgia" w:eastAsia="Georgia" w:hAnsi="Georgia"/>
-          <w:b w:val="0"/>
-          <w:bCs w:val="0"/>
-          <w:i w:val="0"/>
-          <w:iCs w:val="0"/>
-          <w:color w:val="000000"/>
-          <w:sz w:val="22"/>
-          <w:szCs w:val="22"/>
-          <w:rtl w:val="0"/>
-        </w:rPr>
-        <w:t xml:space="preserve"> that C. longa extracts are potential (EC) alternative stains. PCR </w:t>
+          <w:color w:val="000000"/>
+        </w:rPr>
+        <w:t xml:space="preserve"> that C. longa extracts are </w:t>
+      </w:r>
+      <w:r>
+        <w:rPr>
+          <w:highlight w:val="red"/>
+          <w:color w:val="ffffff"/>
+          <w:strike/>
+        </w:rPr>
+        <w:t>potential</w:t>
+      </w:r>
+      <w:r>
+        <w:rPr>
+          <w:color w:val="000000"/>
+        </w:rPr>
+        <w:t xml:space="preserve"> </w:t>
+      </w:r>
+      <w:r>
+        <w:rPr>
+          <w:color w:val="ed7d31"/>
+        </w:rPr>
+        <w:t>(EC)</w:t>
+      </w:r>
+      <w:r>
+        <w:rPr>
+          <w:color w:val="000000"/>
+        </w:rPr>
+        <w:t xml:space="preserve"> alternative stains. PCR </w:t>
       </w:r>
       <w:r>
         <w:rPr>
@@ -11369,7 +11387,7 @@
           <w:szCs w:val="22"/>
           <w:rtl w:val="0"/>
         </w:rPr>
-        <w:t xml:space="preserve"> Red highlights mark type. Orange text marks function. Grey highlight marks an unhedged site. Here, “potential” is retained as a Lexical hedge because it appears in a results/conclusion sentence and qualifies the claim about the extracts.</w:t>
+        <w:t xml:space="preserve"> Colored highlights mark type. Colored text marks function. Grey highlights mark an unhedged site. Here, “potential” is retained as a Lexical hedge because it appears in a results/conclusion sentence and qualifies the claim about the extracts.</w:t>
       </w:r>
       <w:r>
         <w:rPr>

</xml_diff>